<commit_message>
Add gitignore and sample docs
</commit_message>
<xml_diff>
--- a/pROJECT.docx
+++ b/pROJECT.docx
@@ -17,34 +17,11 @@
         <w:t xml:space="preserve">python virtual environment to privately install packages for this specific project. Packages would only be accessible by this project. This is done to ensure that different project that require different package versions don’t break. </w:t>
       </w:r>
       <w:r>
-        <w:t xml:space="preserve"> to separate the installed </w:t>
-      </w:r>
-      <w:proofErr w:type="spellStart"/>
-      <w:r>
-        <w:t>packes</w:t>
-      </w:r>
-      <w:proofErr w:type="spellEnd"/>
-      <w:r>
-        <w:t xml:space="preserve"> – run </w:t>
-      </w:r>
-      <w:r>
-        <w:t xml:space="preserve">python -m </w:t>
-      </w:r>
-      <w:proofErr w:type="spellStart"/>
-      <w:proofErr w:type="gramStart"/>
-      <w:r>
-        <w:t>venv</w:t>
-      </w:r>
-      <w:proofErr w:type="spellEnd"/>
-      <w:r>
-        <w:t xml:space="preserve"> .</w:t>
-      </w:r>
-      <w:proofErr w:type="spellStart"/>
-      <w:r>
-        <w:t>venv</w:t>
-      </w:r>
-      <w:proofErr w:type="spellEnd"/>
-      <w:proofErr w:type="gramEnd"/>
+        <w:t xml:space="preserve"> to separate the installed packes – run </w:t>
+      </w:r>
+      <w:r>
+        <w:t>python -m venv .venv</w:t>
+      </w:r>
       <w:r>
         <w:t xml:space="preserve"> it will create the following folders. </w:t>
       </w:r>
@@ -100,31 +77,10 @@
         </w:numPr>
       </w:pPr>
       <w:r>
-        <w:t xml:space="preserve">Activate </w:t>
-      </w:r>
-      <w:proofErr w:type="spellStart"/>
-      <w:r>
-        <w:t>vm</w:t>
-      </w:r>
-      <w:proofErr w:type="spellEnd"/>
-      <w:proofErr w:type="gramStart"/>
-      <w:r>
-        <w:t xml:space="preserve">: </w:t>
-      </w:r>
-      <w:r>
-        <w:t>.</w:t>
-      </w:r>
-      <w:proofErr w:type="gramEnd"/>
-      <w:r>
-        <w:t>\.</w:t>
-      </w:r>
-      <w:proofErr w:type="spellStart"/>
-      <w:r>
-        <w:t>venv</w:t>
-      </w:r>
-      <w:proofErr w:type="spellEnd"/>
-      <w:r>
-        <w:t>\Scripts\activate</w:t>
+        <w:t xml:space="preserve">Activate vm: </w:t>
+      </w:r>
+      <w:r>
+        <w:t>.\.venv\Scripts\activate</w:t>
       </w:r>
       <w:r>
         <w:drawing>
@@ -173,29 +129,13 @@
         </w:numPr>
       </w:pPr>
       <w:r>
-        <w:t xml:space="preserve">Create requirements.txt and add </w:t>
-      </w:r>
-      <w:proofErr w:type="spellStart"/>
-      <w:r>
-        <w:t>streamlit</w:t>
-      </w:r>
-      <w:proofErr w:type="spellEnd"/>
-      <w:r>
-        <w:t xml:space="preserve"> into it. Then run </w:t>
+        <w:t xml:space="preserve">Create requirements.txt and add streamlit into it. Then run </w:t>
       </w:r>
       <w:r>
         <w:t>pip install -r requirements.txt</w:t>
       </w:r>
       <w:r>
-        <w:t xml:space="preserve"> to install the </w:t>
-      </w:r>
-      <w:proofErr w:type="spellStart"/>
-      <w:r>
-        <w:t>Streamlit</w:t>
-      </w:r>
-      <w:proofErr w:type="spellEnd"/>
-      <w:r>
-        <w:t xml:space="preserve">. </w:t>
+        <w:t xml:space="preserve"> to install the Streamlit. </w:t>
       </w:r>
     </w:p>
     <w:p>
@@ -218,13 +158,8 @@
           <w:numId w:val="1"/>
         </w:numPr>
       </w:pPr>
-      <w:proofErr w:type="spellStart"/>
-      <w:r>
-        <w:t>streamlit</w:t>
-      </w:r>
-      <w:proofErr w:type="spellEnd"/>
-      <w:r>
-        <w:t xml:space="preserve"> run app.py</w:t>
+      <w:r>
+        <w:t>streamlit run app.py</w:t>
       </w:r>
       <w:r>
         <w:t xml:space="preserve"> – run it locally </w:t>
@@ -239,23 +174,7 @@
         </w:numPr>
       </w:pPr>
       <w:r>
-        <w:t xml:space="preserve">Create </w:t>
-      </w:r>
-      <w:proofErr w:type="spellStart"/>
-      <w:r>
-        <w:t>github</w:t>
-      </w:r>
-      <w:proofErr w:type="spellEnd"/>
-      <w:r>
-        <w:t xml:space="preserve"> repo and push to </w:t>
-      </w:r>
-      <w:proofErr w:type="spellStart"/>
-      <w:r>
-        <w:t>github</w:t>
-      </w:r>
-      <w:proofErr w:type="spellEnd"/>
-      <w:r>
-        <w:t xml:space="preserve">: </w:t>
+        <w:t xml:space="preserve">Create github repo and push to github: </w:t>
       </w:r>
     </w:p>
     <w:p>
@@ -273,19 +192,113 @@
         <w:rPr>
           <w:rStyle w:val="m"/>
         </w:rPr>
+        <w:t xml:space="preserve">Install git </w:t>
+      </w:r>
+      <w:hyperlink r:id="rId7" w:history="1">
+        <w:r>
+          <w:rPr>
+            <w:rStyle w:val="Hyperlink"/>
+          </w:rPr>
+          <w:t>https://git-scm.com/install/windows</w:t>
+        </w:r>
+      </w:hyperlink>
+    </w:p>
+    <w:p>
+      <w:pPr>
+        <w:pStyle w:val="ListParagraph"/>
+        <w:numPr>
+          <w:ilvl w:val="2"/>
+          <w:numId w:val="1"/>
+        </w:numPr>
+        <w:rPr>
+          <w:rStyle w:val="m"/>
+        </w:rPr>
+      </w:pPr>
+      <w:r>
+        <w:rPr>
+          <w:rStyle w:val="m"/>
+        </w:rPr>
+        <w:t>Re-open VS code</w:t>
+      </w:r>
+    </w:p>
+    <w:p>
+      <w:pPr>
+        <w:pStyle w:val="ListParagraph"/>
+        <w:numPr>
+          <w:ilvl w:val="1"/>
+          <w:numId w:val="1"/>
+        </w:numPr>
+        <w:rPr>
+          <w:rStyle w:val="m"/>
+        </w:rPr>
+      </w:pPr>
+      <w:bookmarkStart w:id="0" w:name="_Hlk231844830"/>
+      <w:r>
+        <w:rPr>
+          <w:rStyle w:val="m"/>
+        </w:rPr>
+        <w:t xml:space="preserve">Configure git identity: </w:t>
+      </w:r>
+    </w:p>
+    <w:p>
+      <w:pPr>
+        <w:pStyle w:val="ListParagraph"/>
+        <w:numPr>
+          <w:ilvl w:val="2"/>
+          <w:numId w:val="1"/>
+        </w:numPr>
+      </w:pPr>
+      <w:r>
+        <w:t xml:space="preserve">  git config --global user.email "</w:t>
+      </w:r>
+      <w:r>
+        <w:t xml:space="preserve"> ozamericos@gmail.com</w:t>
+      </w:r>
+      <w:r>
+        <w:t>"</w:t>
+      </w:r>
+    </w:p>
+    <w:p>
+      <w:pPr>
+        <w:pStyle w:val="ListParagraph"/>
+        <w:numPr>
+          <w:ilvl w:val="2"/>
+          <w:numId w:val="1"/>
+        </w:numPr>
+        <w:rPr>
+          <w:rStyle w:val="m"/>
+        </w:rPr>
+      </w:pPr>
+      <w:r>
+        <w:t xml:space="preserve">  git config --global user.name "OlegZas"</w:t>
+      </w:r>
+    </w:p>
+    <w:p>
+      <w:pPr>
+        <w:pStyle w:val="ListParagraph"/>
+        <w:numPr>
+          <w:ilvl w:val="1"/>
+          <w:numId w:val="1"/>
+        </w:numPr>
+        <w:rPr>
+          <w:rStyle w:val="m"/>
+        </w:rPr>
+      </w:pPr>
+      <w:r>
+        <w:rPr>
+          <w:rStyle w:val="m"/>
+        </w:rPr>
         <w:t>git</w:t>
       </w:r>
       <w:r>
         <w:t xml:space="preserve"> </w:t>
       </w:r>
-      <w:proofErr w:type="spellStart"/>
       <w:r>
         <w:rPr>
           <w:rStyle w:val="m"/>
         </w:rPr>
         <w:t>init</w:t>
       </w:r>
-      <w:proofErr w:type="spellEnd"/>
       <w:r>
         <w:br/>
       </w:r>
@@ -298,7 +311,6 @@
       <w:r>
         <w:t xml:space="preserve"> </w:t>
       </w:r>
-      <w:proofErr w:type="gramStart"/>
       <w:r>
         <w:rPr>
           <w:rStyle w:val="m"/>
@@ -308,7 +320,6 @@
       <w:r>
         <w:t xml:space="preserve"> .</w:t>
       </w:r>
-      <w:proofErr w:type="gramEnd"/>
       <w:r>
         <w:br/>
       </w:r>
@@ -349,21 +360,7 @@
         <w:rPr>
           <w:rStyle w:val="k"/>
         </w:rPr>
-        <w:t xml:space="preserve">"Initial </w:t>
-      </w:r>
-      <w:proofErr w:type="spellStart"/>
-      <w:r>
-        <w:rPr>
-          <w:rStyle w:val="k"/>
-        </w:rPr>
-        <w:t>Streamlit</w:t>
-      </w:r>
-      <w:proofErr w:type="spellEnd"/>
-      <w:r>
-        <w:rPr>
-          <w:rStyle w:val="k"/>
-        </w:rPr>
-        <w:t xml:space="preserve"> app"</w:t>
+        <w:t>"Initial Streamlit app"</w:t>
       </w:r>
       <w:r>
         <w:br/>
@@ -483,7 +480,7 @@
         <w:rPr>
           <w:rStyle w:val="m"/>
         </w:rPr>
-        <w:t>YOUR_USERNAME</w:t>
+        <w:t>OlegZas</w:t>
       </w:r>
       <w:r>
         <w:rPr>
@@ -492,10 +489,13 @@
         <w:t>/</w:t>
       </w:r>
       <w:r>
-        <w:rPr>
-          <w:rStyle w:val="m"/>
-        </w:rPr>
-        <w:t>data-prep-ai</w:t>
+        <w:t xml:space="preserve"> </w:t>
+      </w:r>
+      <w:r>
+        <w:rPr>
+          <w:rStyle w:val="m"/>
+        </w:rPr>
+        <w:t>project-job-prep-ai</w:t>
       </w:r>
       <w:r>
         <w:t>.</w:t>
@@ -558,6 +558,7 @@
         <w:t>main</w:t>
       </w:r>
     </w:p>
+    <w:bookmarkEnd w:id="0"/>
     <w:p>
       <w:pPr>
         <w:pStyle w:val="ListParagraph"/>
@@ -573,24 +574,8 @@
         <w:rPr>
           <w:rStyle w:val="m"/>
         </w:rPr>
-        <w:t xml:space="preserve">add </w:t>
-      </w:r>
-      <w:proofErr w:type="gramStart"/>
-      <w:r>
-        <w:rPr>
-          <w:rStyle w:val="m"/>
-        </w:rPr>
-        <w:t>to .</w:t>
-      </w:r>
-      <w:proofErr w:type="spellStart"/>
-      <w:r>
-        <w:rPr>
-          <w:rStyle w:val="m"/>
-        </w:rPr>
-        <w:t>gitignore</w:t>
-      </w:r>
-      <w:proofErr w:type="spellEnd"/>
-      <w:proofErr w:type="gramEnd"/>
+        <w:t>add to .gitignore</w:t>
+      </w:r>
     </w:p>
     <w:p>
       <w:pPr>
@@ -600,73 +585,33 @@
           <w:numId w:val="1"/>
         </w:numPr>
       </w:pPr>
-      <w:proofErr w:type="gramStart"/>
-      <w:r>
-        <w:t>.</w:t>
-      </w:r>
-      <w:proofErr w:type="spellStart"/>
-      <w:r>
-        <w:t>venv</w:t>
-      </w:r>
-      <w:proofErr w:type="spellEnd"/>
-      <w:proofErr w:type="gramEnd"/>
-      <w:r>
-        <w:t>/</w:t>
+      <w:r>
+        <w:t>.venv/</w:t>
       </w:r>
       <w:r>
         <w:br/>
-        <w:t>__</w:t>
-      </w:r>
-      <w:proofErr w:type="spellStart"/>
-      <w:r>
-        <w:t>pycache</w:t>
-      </w:r>
-      <w:proofErr w:type="spellEnd"/>
-      <w:r>
-        <w:t>__/</w:t>
+        <w:t>__pycache__/</w:t>
       </w:r>
       <w:r>
         <w:br/>
-        <w:t>*.</w:t>
-      </w:r>
-      <w:proofErr w:type="spellStart"/>
-      <w:r>
-        <w:t>pyc</w:t>
-      </w:r>
-      <w:proofErr w:type="spellEnd"/>
+        <w:t>*.pyc</w:t>
+      </w:r>
       <w:r>
         <w:br/>
         <w:t>.env</w:t>
       </w:r>
       <w:r>
         <w:br/>
-        <w:t>.</w:t>
-      </w:r>
-      <w:proofErr w:type="spellStart"/>
-      <w:r>
-        <w:t>streamlit</w:t>
-      </w:r>
-      <w:proofErr w:type="spellEnd"/>
-      <w:r>
-        <w:t>/</w:t>
+        <w:t>.streamlit/</w:t>
       </w:r>
       <w:r>
         <w:br/>
-        <w:t>.</w:t>
-      </w:r>
-      <w:proofErr w:type="spellStart"/>
-      <w:r>
-        <w:t>DS_Store</w:t>
-      </w:r>
-      <w:proofErr w:type="spellEnd"/>
+        <w:t>.DS_Store</w:t>
+      </w:r>
       <w:r>
         <w:br/>
-      </w:r>
-      <w:proofErr w:type="spellStart"/>
-      <w:r>
         <w:t>Thumbs.db</w:t>
       </w:r>
-      <w:proofErr w:type="spellEnd"/>
     </w:p>
     <w:p>
       <w:pPr>
@@ -700,7 +645,6 @@
       <w:r>
         <w:t xml:space="preserve"> </w:t>
       </w:r>
-      <w:proofErr w:type="gramStart"/>
       <w:r>
         <w:rPr>
           <w:rStyle w:val="m"/>
@@ -710,7 +654,6 @@
       <w:r>
         <w:t xml:space="preserve"> .</w:t>
       </w:r>
-      <w:proofErr w:type="gramEnd"/>
       <w:r>
         <w:br/>
       </w:r>
@@ -751,21 +694,7 @@
         <w:rPr>
           <w:rStyle w:val="k"/>
         </w:rPr>
-        <w:t xml:space="preserve">"Add </w:t>
-      </w:r>
-      <w:proofErr w:type="spellStart"/>
-      <w:r>
-        <w:rPr>
-          <w:rStyle w:val="k"/>
-        </w:rPr>
-        <w:t>gitignore</w:t>
-      </w:r>
-      <w:proofErr w:type="spellEnd"/>
-      <w:r>
-        <w:rPr>
-          <w:rStyle w:val="k"/>
-        </w:rPr>
-        <w:t xml:space="preserve"> and sample docs"</w:t>
+        <w:t>"Add gitignore and sample docs"</w:t>
       </w:r>
       <w:r>
         <w:br/>
@@ -794,6 +723,16 @@
           <w:numId w:val="1"/>
         </w:numPr>
       </w:pPr>
+    </w:p>
+    <w:p>
+      <w:pPr>
+        <w:tabs>
+          <w:tab w:val="left" w:pos="1413"/>
+        </w:tabs>
+      </w:pPr>
+      <w:r>
+        <w:tab/>
+      </w:r>
     </w:p>
     <w:sectPr>
       <w:pgSz w:w="12240" w:h="15840"/>
@@ -1354,6 +1293,29 @@
     <w:basedOn w:val="DefaultParagraphFont"/>
     <w:rsid w:val="007E51C0"/>
   </w:style>
+  <w:style w:type="character" w:styleId="Hyperlink">
+    <w:name w:val="Hyperlink"/>
+    <w:basedOn w:val="DefaultParagraphFont"/>
+    <w:uiPriority w:val="99"/>
+    <w:unhideWhenUsed/>
+    <w:rsid w:val="00E772EA"/>
+    <w:rPr>
+      <w:color w:val="0563C1" w:themeColor="hyperlink"/>
+      <w:u w:val="single"/>
+    </w:rPr>
+  </w:style>
+  <w:style w:type="character" w:styleId="UnresolvedMention">
+    <w:name w:val="Unresolved Mention"/>
+    <w:basedOn w:val="DefaultParagraphFont"/>
+    <w:uiPriority w:val="99"/>
+    <w:semiHidden/>
+    <w:unhideWhenUsed/>
+    <w:rsid w:val="00E772EA"/>
+    <w:rPr>
+      <w:color w:val="605E5C"/>
+      <w:shd w:val="clear" w:color="auto" w:fill="E1DFDD"/>
+    </w:rPr>
+  </w:style>
 </w:styles>
 </file>
 

</xml_diff>

<commit_message>
Preserve completed class project baseline
</commit_message>
<xml_diff>
--- a/pROJECT.docx
+++ b/pROJECT.docx
@@ -17,11 +17,34 @@
         <w:t xml:space="preserve">python virtual environment to privately install packages for this specific project. Packages would only be accessible by this project. This is done to ensure that different project that require different package versions don’t break. </w:t>
       </w:r>
       <w:r>
-        <w:t xml:space="preserve"> to separate the installed packes – run </w:t>
-      </w:r>
-      <w:r>
-        <w:t>python -m venv .venv</w:t>
-      </w:r>
+        <w:t xml:space="preserve"> to separate the installed </w:t>
+      </w:r>
+      <w:proofErr w:type="spellStart"/>
+      <w:r>
+        <w:t>packes</w:t>
+      </w:r>
+      <w:proofErr w:type="spellEnd"/>
+      <w:r>
+        <w:t xml:space="preserve"> – run </w:t>
+      </w:r>
+      <w:r>
+        <w:t xml:space="preserve">python -m </w:t>
+      </w:r>
+      <w:proofErr w:type="spellStart"/>
+      <w:proofErr w:type="gramStart"/>
+      <w:r>
+        <w:t>venv</w:t>
+      </w:r>
+      <w:proofErr w:type="spellEnd"/>
+      <w:r>
+        <w:t xml:space="preserve"> .</w:t>
+      </w:r>
+      <w:proofErr w:type="spellStart"/>
+      <w:r>
+        <w:t>venv</w:t>
+      </w:r>
+      <w:proofErr w:type="spellEnd"/>
+      <w:proofErr w:type="gramEnd"/>
       <w:r>
         <w:t xml:space="preserve"> it will create the following folders. </w:t>
       </w:r>
@@ -77,10 +100,31 @@
         </w:numPr>
       </w:pPr>
       <w:r>
-        <w:t xml:space="preserve">Activate vm: </w:t>
-      </w:r>
-      <w:r>
-        <w:t>.\.venv\Scripts\activate</w:t>
+        <w:t xml:space="preserve">Activate </w:t>
+      </w:r>
+      <w:proofErr w:type="spellStart"/>
+      <w:r>
+        <w:t>vm</w:t>
+      </w:r>
+      <w:proofErr w:type="spellEnd"/>
+      <w:proofErr w:type="gramStart"/>
+      <w:r>
+        <w:t xml:space="preserve">: </w:t>
+      </w:r>
+      <w:r>
+        <w:t>.</w:t>
+      </w:r>
+      <w:proofErr w:type="gramEnd"/>
+      <w:r>
+        <w:t>\.</w:t>
+      </w:r>
+      <w:proofErr w:type="spellStart"/>
+      <w:r>
+        <w:t>venv</w:t>
+      </w:r>
+      <w:proofErr w:type="spellEnd"/>
+      <w:r>
+        <w:t>\Scripts\activate</w:t>
       </w:r>
       <w:r>
         <w:drawing>
@@ -129,13 +173,29 @@
         </w:numPr>
       </w:pPr>
       <w:r>
-        <w:t xml:space="preserve">Create requirements.txt and add streamlit into it. Then run </w:t>
+        <w:t xml:space="preserve">Create requirements.txt and add </w:t>
+      </w:r>
+      <w:proofErr w:type="spellStart"/>
+      <w:r>
+        <w:t>streamlit</w:t>
+      </w:r>
+      <w:proofErr w:type="spellEnd"/>
+      <w:r>
+        <w:t xml:space="preserve"> into it. Then run </w:t>
       </w:r>
       <w:r>
         <w:t>pip install -r requirements.txt</w:t>
       </w:r>
       <w:r>
-        <w:t xml:space="preserve"> to install the Streamlit. </w:t>
+        <w:t xml:space="preserve"> to install the </w:t>
+      </w:r>
+      <w:proofErr w:type="spellStart"/>
+      <w:r>
+        <w:t>Streamlit</w:t>
+      </w:r>
+      <w:proofErr w:type="spellEnd"/>
+      <w:r>
+        <w:t xml:space="preserve">. </w:t>
       </w:r>
     </w:p>
     <w:p>
@@ -158,8 +218,13 @@
           <w:numId w:val="1"/>
         </w:numPr>
       </w:pPr>
-      <w:r>
-        <w:t>streamlit run app.py</w:t>
+      <w:proofErr w:type="spellStart"/>
+      <w:r>
+        <w:t>streamlit</w:t>
+      </w:r>
+      <w:proofErr w:type="spellEnd"/>
+      <w:r>
+        <w:t xml:space="preserve"> run app.py</w:t>
       </w:r>
       <w:r>
         <w:t xml:space="preserve"> – run it locally </w:t>
@@ -174,7 +239,23 @@
         </w:numPr>
       </w:pPr>
       <w:r>
-        <w:t xml:space="preserve">Create github repo and push to github: </w:t>
+        <w:t xml:space="preserve">Create </w:t>
+      </w:r>
+      <w:proofErr w:type="spellStart"/>
+      <w:r>
+        <w:t>github</w:t>
+      </w:r>
+      <w:proofErr w:type="spellEnd"/>
+      <w:r>
+        <w:t xml:space="preserve"> repo and push to </w:t>
+      </w:r>
+      <w:proofErr w:type="spellStart"/>
+      <w:r>
+        <w:t>github</w:t>
+      </w:r>
+      <w:proofErr w:type="spellEnd"/>
+      <w:r>
+        <w:t xml:space="preserve">: </w:t>
       </w:r>
     </w:p>
     <w:p>
@@ -249,7 +330,17 @@
         </w:numPr>
       </w:pPr>
       <w:r>
-        <w:t xml:space="preserve">  git config --global user.email "</w:t>
+        <w:t xml:space="preserve">  git config --global </w:t>
+      </w:r>
+      <w:proofErr w:type="spellStart"/>
+      <w:proofErr w:type="gramStart"/>
+      <w:r>
+        <w:t>user.email</w:t>
+      </w:r>
+      <w:proofErr w:type="spellEnd"/>
+      <w:proofErr w:type="gramEnd"/>
+      <w:r>
+        <w:t xml:space="preserve"> "</w:t>
       </w:r>
       <w:r>
         <w:t xml:space="preserve"> ozamericos@gmail.com</w:t>
@@ -270,7 +361,15 @@
         </w:rPr>
       </w:pPr>
       <w:r>
-        <w:t xml:space="preserve">  git config --global user.name "OlegZas"</w:t>
+        <w:t xml:space="preserve">  git config --global user.name "</w:t>
+      </w:r>
+      <w:proofErr w:type="spellStart"/>
+      <w:r>
+        <w:t>OlegZas</w:t>
+      </w:r>
+      <w:proofErr w:type="spellEnd"/>
+      <w:r>
+        <w:t>"</w:t>
       </w:r>
     </w:p>
     <w:p>
@@ -293,12 +392,14 @@
       <w:r>
         <w:t xml:space="preserve"> </w:t>
       </w:r>
+      <w:proofErr w:type="spellStart"/>
       <w:r>
         <w:rPr>
           <w:rStyle w:val="m"/>
         </w:rPr>
         <w:t>init</w:t>
       </w:r>
+      <w:proofErr w:type="spellEnd"/>
       <w:r>
         <w:br/>
       </w:r>
@@ -311,6 +412,7 @@
       <w:r>
         <w:t xml:space="preserve"> </w:t>
       </w:r>
+      <w:proofErr w:type="gramStart"/>
       <w:r>
         <w:rPr>
           <w:rStyle w:val="m"/>
@@ -320,6 +422,7 @@
       <w:r>
         <w:t xml:space="preserve"> .</w:t>
       </w:r>
+      <w:proofErr w:type="gramEnd"/>
       <w:r>
         <w:br/>
       </w:r>
@@ -360,7 +463,21 @@
         <w:rPr>
           <w:rStyle w:val="k"/>
         </w:rPr>
-        <w:t>"Initial Streamlit app"</w:t>
+        <w:t xml:space="preserve">"Initial </w:t>
+      </w:r>
+      <w:proofErr w:type="spellStart"/>
+      <w:r>
+        <w:rPr>
+          <w:rStyle w:val="k"/>
+        </w:rPr>
+        <w:t>Streamlit</w:t>
+      </w:r>
+      <w:proofErr w:type="spellEnd"/>
+      <w:r>
+        <w:rPr>
+          <w:rStyle w:val="k"/>
+        </w:rPr>
+        <w:t xml:space="preserve"> app"</w:t>
       </w:r>
       <w:r>
         <w:br/>
@@ -495,7 +612,14 @@
         <w:rPr>
           <w:rStyle w:val="m"/>
         </w:rPr>
-        <w:t>project-job-prep-ai</w:t>
+        <w:t>project-job-prep-</w:t>
+      </w:r>
+      <w:proofErr w:type="spellStart"/>
+      <w:r>
+        <w:rPr>
+          <w:rStyle w:val="m"/>
+        </w:rPr>
+        <w:t>ai</w:t>
       </w:r>
       <w:r>
         <w:t>.</w:t>
@@ -506,6 +630,7 @@
         </w:rPr>
         <w:t>git</w:t>
       </w:r>
+      <w:proofErr w:type="spellEnd"/>
       <w:r>
         <w:br/>
       </w:r>
@@ -574,8 +699,24 @@
         <w:rPr>
           <w:rStyle w:val="m"/>
         </w:rPr>
-        <w:t>add to .gitignore</w:t>
-      </w:r>
+        <w:t xml:space="preserve">add </w:t>
+      </w:r>
+      <w:proofErr w:type="gramStart"/>
+      <w:r>
+        <w:rPr>
+          <w:rStyle w:val="m"/>
+        </w:rPr>
+        <w:t>to .</w:t>
+      </w:r>
+      <w:proofErr w:type="spellStart"/>
+      <w:r>
+        <w:rPr>
+          <w:rStyle w:val="m"/>
+        </w:rPr>
+        <w:t>gitignore</w:t>
+      </w:r>
+      <w:proofErr w:type="spellEnd"/>
+      <w:proofErr w:type="gramEnd"/>
     </w:p>
     <w:p>
       <w:pPr>
@@ -585,33 +726,73 @@
           <w:numId w:val="1"/>
         </w:numPr>
       </w:pPr>
-      <w:r>
-        <w:t>.venv/</w:t>
+      <w:proofErr w:type="gramStart"/>
+      <w:r>
+        <w:t>.</w:t>
+      </w:r>
+      <w:proofErr w:type="spellStart"/>
+      <w:r>
+        <w:t>venv</w:t>
+      </w:r>
+      <w:proofErr w:type="spellEnd"/>
+      <w:proofErr w:type="gramEnd"/>
+      <w:r>
+        <w:t>/</w:t>
       </w:r>
       <w:r>
         <w:br/>
-        <w:t>__pycache__/</w:t>
+        <w:t>__</w:t>
+      </w:r>
+      <w:proofErr w:type="spellStart"/>
+      <w:r>
+        <w:t>pycache</w:t>
+      </w:r>
+      <w:proofErr w:type="spellEnd"/>
+      <w:r>
+        <w:t>__/</w:t>
       </w:r>
       <w:r>
         <w:br/>
-        <w:t>*.pyc</w:t>
-      </w:r>
+        <w:t>*.</w:t>
+      </w:r>
+      <w:proofErr w:type="spellStart"/>
+      <w:r>
+        <w:t>pyc</w:t>
+      </w:r>
+      <w:proofErr w:type="spellEnd"/>
       <w:r>
         <w:br/>
         <w:t>.env</w:t>
       </w:r>
       <w:r>
         <w:br/>
-        <w:t>.streamlit/</w:t>
+        <w:t>.</w:t>
+      </w:r>
+      <w:proofErr w:type="spellStart"/>
+      <w:r>
+        <w:t>streamlit</w:t>
+      </w:r>
+      <w:proofErr w:type="spellEnd"/>
+      <w:r>
+        <w:t>/</w:t>
       </w:r>
       <w:r>
         <w:br/>
-        <w:t>.DS_Store</w:t>
-      </w:r>
+        <w:t>.</w:t>
+      </w:r>
+      <w:proofErr w:type="spellStart"/>
+      <w:r>
+        <w:t>DS_Store</w:t>
+      </w:r>
+      <w:proofErr w:type="spellEnd"/>
       <w:r>
         <w:br/>
+      </w:r>
+      <w:proofErr w:type="spellStart"/>
+      <w:r>
         <w:t>Thumbs.db</w:t>
       </w:r>
+      <w:proofErr w:type="spellEnd"/>
     </w:p>
     <w:p>
       <w:pPr>
@@ -645,6 +826,7 @@
       <w:r>
         <w:t xml:space="preserve"> </w:t>
       </w:r>
+      <w:proofErr w:type="gramStart"/>
       <w:r>
         <w:rPr>
           <w:rStyle w:val="m"/>
@@ -654,6 +836,7 @@
       <w:r>
         <w:t xml:space="preserve"> .</w:t>
       </w:r>
+      <w:proofErr w:type="gramEnd"/>
       <w:r>
         <w:br/>
       </w:r>
@@ -694,7 +877,21 @@
         <w:rPr>
           <w:rStyle w:val="k"/>
         </w:rPr>
-        <w:t>"Add gitignore and sample docs"</w:t>
+        <w:t xml:space="preserve">"Add </w:t>
+      </w:r>
+      <w:proofErr w:type="spellStart"/>
+      <w:r>
+        <w:rPr>
+          <w:rStyle w:val="k"/>
+        </w:rPr>
+        <w:t>gitignore</w:t>
+      </w:r>
+      <w:proofErr w:type="spellEnd"/>
+      <w:r>
+        <w:rPr>
+          <w:rStyle w:val="k"/>
+        </w:rPr>
+        <w:t xml:space="preserve"> and sample docs"</w:t>
       </w:r>
       <w:r>
         <w:br/>
@@ -733,6 +930,144 @@
       <w:r>
         <w:tab/>
       </w:r>
+      <w:r>
+        <w:drawing>
+          <wp:inline distT="0" distB="0" distL="0" distR="0" wp14:anchorId="196AB8B7" wp14:editId="77B7C613">
+            <wp:extent cx="5943600" cy="3820160"/>
+            <wp:effectExtent l="0" t="0" r="0" b="8890"/>
+            <wp:docPr id="3" name="Picture 3"/>
+            <wp:cNvGraphicFramePr>
+              <a:graphicFrameLocks xmlns:a="http://schemas.openxmlformats.org/drawingml/2006/main" noChangeAspect="1"/>
+            </wp:cNvGraphicFramePr>
+            <a:graphic xmlns:a="http://schemas.openxmlformats.org/drawingml/2006/main">
+              <a:graphicData uri="http://schemas.openxmlformats.org/drawingml/2006/picture">
+                <pic:pic xmlns:pic="http://schemas.openxmlformats.org/drawingml/2006/picture">
+                  <pic:nvPicPr>
+                    <pic:cNvPr id="1" name=""/>
+                    <pic:cNvPicPr/>
+                  </pic:nvPicPr>
+                  <pic:blipFill>
+                    <a:blip r:embed="rId8"/>
+                    <a:stretch>
+                      <a:fillRect/>
+                    </a:stretch>
+                  </pic:blipFill>
+                  <pic:spPr>
+                    <a:xfrm>
+                      <a:off x="0" y="0"/>
+                      <a:ext cx="5943600" cy="3820160"/>
+                    </a:xfrm>
+                    <a:prstGeom prst="rect">
+                      <a:avLst/>
+                    </a:prstGeom>
+                  </pic:spPr>
+                </pic:pic>
+              </a:graphicData>
+            </a:graphic>
+          </wp:inline>
+        </w:drawing>
+      </w:r>
+    </w:p>
+    <w:p/>
+    <w:p>
+      <w:pPr>
+        <w:pStyle w:val="ListParagraph"/>
+        <w:numPr>
+          <w:ilvl w:val="0"/>
+          <w:numId w:val="1"/>
+        </w:numPr>
+      </w:pPr>
+      <w:r>
+        <w:t xml:space="preserve">Update requirements: </w:t>
+      </w:r>
+    </w:p>
+    <w:p>
+      <w:pPr>
+        <w:pStyle w:val="ListParagraph"/>
+        <w:numPr>
+          <w:ilvl w:val="1"/>
+          <w:numId w:val="1"/>
+        </w:numPr>
+      </w:pPr>
+      <w:proofErr w:type="spellStart"/>
+      <w:r>
+        <w:t>streamlit</w:t>
+      </w:r>
+      <w:proofErr w:type="spellEnd"/>
+      <w:r>
+        <w:br/>
+      </w:r>
+      <w:proofErr w:type="spellStart"/>
+      <w:r>
+        <w:t>pypdf</w:t>
+      </w:r>
+      <w:proofErr w:type="spellEnd"/>
+      <w:r>
+        <w:br/>
+      </w:r>
+      <w:proofErr w:type="spellStart"/>
+      <w:r>
+        <w:t>openai</w:t>
+      </w:r>
+      <w:proofErr w:type="spellEnd"/>
+      <w:r>
+        <w:br/>
+      </w:r>
+      <w:proofErr w:type="spellStart"/>
+      <w:r>
+        <w:t>numpy</w:t>
+      </w:r>
+      <w:proofErr w:type="spellEnd"/>
+      <w:r>
+        <w:br/>
+        <w:t>python-</w:t>
+      </w:r>
+      <w:proofErr w:type="spellStart"/>
+      <w:r>
+        <w:t>dotenv</w:t>
+      </w:r>
+      <w:proofErr w:type="spellEnd"/>
+    </w:p>
+    <w:p>
+      <w:pPr>
+        <w:pStyle w:val="ListParagraph"/>
+        <w:numPr>
+          <w:ilvl w:val="1"/>
+          <w:numId w:val="1"/>
+        </w:numPr>
+      </w:pPr>
+      <w:r>
+        <w:t>pip install -r requirements.txt</w:t>
+      </w:r>
+    </w:p>
+    <w:p>
+      <w:pPr>
+        <w:pStyle w:val="ListParagraph"/>
+        <w:numPr>
+          <w:ilvl w:val="0"/>
+          <w:numId w:val="1"/>
+        </w:numPr>
+      </w:pPr>
+      <w:r>
+        <w:t xml:space="preserve">On </w:t>
+      </w:r>
+      <w:proofErr w:type="spellStart"/>
+      <w:r>
+        <w:t>OpenAI</w:t>
+      </w:r>
+      <w:proofErr w:type="spellEnd"/>
+      <w:r>
+        <w:t xml:space="preserve"> generate API key. </w:t>
+      </w:r>
+    </w:p>
+    <w:p>
+      <w:pPr>
+        <w:pStyle w:val="ListParagraph"/>
+        <w:numPr>
+          <w:ilvl w:val="0"/>
+          <w:numId w:val="1"/>
+        </w:numPr>
+      </w:pPr>
     </w:p>
     <w:sectPr>
       <w:pgSz w:w="12240" w:h="15840"/>

</xml_diff>